<commit_message>
Corrected UI elements in the HTML concept
</commit_message>
<xml_diff>
--- a/ideas_ressources_files/initial_game_design_concept.docx
+++ b/ideas_ressources_files/initial_game_design_concept.docx
@@ -1,6 +1,6 @@
 
 <file path=word/document.xml><?xml version="1.0" encoding="utf-8"?>
-<w:document xmlns:wpc="http://schemas.microsoft.com/office/word/2010/wordprocessingCanvas" xmlns:cx="http://schemas.microsoft.com/office/drawing/2014/chartex" xmlns:cx1="http://schemas.microsoft.com/office/drawing/2015/9/8/chartex" xmlns:cx2="http://schemas.microsoft.com/office/drawing/2015/10/21/chartex" xmlns:cx3="http://schemas.microsoft.com/office/drawing/2016/5/9/chartex" xmlns:cx4="http://schemas.microsoft.com/office/drawing/2016/5/10/chartex" xmlns:cx5="http://schemas.microsoft.com/office/drawing/2016/5/11/chartex" xmlns:cx6="http://schemas.microsoft.com/office/drawing/2016/5/12/chartex" xmlns:cx7="http://schemas.microsoft.com/office/drawing/2016/5/13/chartex" xmlns:cx8="http://schemas.microsoft.com/office/drawing/2016/5/14/chartex" xmlns:mc="http://schemas.openxmlformats.org/markup-compatibility/2006" xmlns:aink="http://schemas.microsoft.com/office/drawing/2016/ink" xmlns:am3d="http://schemas.microsoft.com/office/drawing/2017/model3d" xmlns:o="urn:schemas-microsoft-com:office:office" xmlns:oel="http://schemas.microsoft.com/office/2019/extlst" xmlns:r="http://schemas.openxmlformats.org/officeDocument/2006/relationships" xmlns:m="http://schemas.openxmlformats.org/officeDocument/2006/math" xmlns:v="urn:schemas-microsoft-com:vml" xmlns:wp14="http://schemas.microsoft.com/office/word/2010/wordprocessingDrawing" xmlns:wp="http://schemas.openxmlformats.org/drawingml/2006/wordprocessingDrawing" xmlns:w10="urn:schemas-microsoft-com:office:word" xmlns:w="http://schemas.openxmlformats.org/wordprocessingml/2006/main" xmlns:w14="http://schemas.microsoft.com/office/word/2010/wordml" xmlns:w15="http://schemas.microsoft.com/office/word/2012/wordml" xmlns:w16cex="http://schemas.microsoft.com/office/word/2018/wordml/cex" xmlns:w16cid="http://schemas.microsoft.com/office/word/2016/wordml/cid" xmlns:w16="http://schemas.microsoft.com/office/word/2018/wordml" xmlns:w16du="http://schemas.microsoft.com/office/word/2023/wordml/word16du" xmlns:w16sdtdh="http://schemas.microsoft.com/office/word/2020/wordml/sdtdatahash" xmlns:w16sdtfl="http://schemas.microsoft.com/office/word/2024/wordml/sdtformatlock" xmlns:w16se="http://schemas.microsoft.com/office/word/2015/wordml/symex" xmlns:wpg="http://schemas.microsoft.com/office/word/2010/wordprocessingGroup" xmlns:wpi="http://schemas.microsoft.com/office/word/2010/wordprocessingInk" xmlns:wne="http://schemas.microsoft.com/office/word/2006/wordml" xmlns:wps="http://schemas.microsoft.com/office/word/2010/wordprocessingShape" mc:Ignorable="w14 w15 w16se w16cid w16 w16cex w16sdtdh w16sdtfl w16du wp14">
+<w:document xmlns:wpc="http://schemas.microsoft.com/office/word/2010/wordprocessingCanvas" xmlns:cx="http://schemas.microsoft.com/office/drawing/2014/chartex" xmlns:cx1="http://schemas.microsoft.com/office/drawing/2015/9/8/chartex" xmlns:cx2="http://schemas.microsoft.com/office/drawing/2015/10/21/chartex" xmlns:cx3="http://schemas.microsoft.com/office/drawing/2016/5/9/chartex" xmlns:cx4="http://schemas.microsoft.com/office/drawing/2016/5/10/chartex" xmlns:cx5="http://schemas.microsoft.com/office/drawing/2016/5/11/chartex" xmlns:cx6="http://schemas.microsoft.com/office/drawing/2016/5/12/chartex" xmlns:cx7="http://schemas.microsoft.com/office/drawing/2016/5/13/chartex" xmlns:cx8="http://schemas.microsoft.com/office/drawing/2016/5/14/chartex" xmlns:mc="http://schemas.openxmlformats.org/markup-compatibility/2006" xmlns:aink="http://schemas.microsoft.com/office/drawing/2016/ink" xmlns:am3d="http://schemas.microsoft.com/office/drawing/2017/model3d" xmlns:o="urn:schemas-microsoft-com:office:office" xmlns:oel="http://schemas.microsoft.com/office/2019/extlst" xmlns:r="http://schemas.openxmlformats.org/officeDocument/2006/relationships" xmlns:m="http://schemas.openxmlformats.org/officeDocument/2006/math" xmlns:v="urn:schemas-microsoft-com:vml" xmlns:wp14="http://schemas.microsoft.com/office/word/2010/wordprocessingDrawing" xmlns:wp="http://schemas.openxmlformats.org/drawingml/2006/wordprocessingDrawing" xmlns:w10="urn:schemas-microsoft-com:office:word" xmlns:w="http://schemas.openxmlformats.org/wordprocessingml/2006/main" xmlns:w14="http://schemas.microsoft.com/office/word/2010/wordml" xmlns:w15="http://schemas.microsoft.com/office/word/2012/wordml" xmlns:w16cex="http://schemas.microsoft.com/office/word/2018/wordml/cex" xmlns:w16cid="http://schemas.microsoft.com/office/word/2016/wordml/cid" xmlns:w16="http://schemas.microsoft.com/office/word/2018/wordml" xmlns:w16sdtdh="http://schemas.microsoft.com/office/word/2020/wordml/sdtdatahash" xmlns:w16se="http://schemas.microsoft.com/office/word/2015/wordml/symex" xmlns:wpg="http://schemas.microsoft.com/office/word/2010/wordprocessingGroup" xmlns:wpi="http://schemas.microsoft.com/office/word/2010/wordprocessingInk" xmlns:wne="http://schemas.microsoft.com/office/word/2006/wordml" xmlns:wps="http://schemas.microsoft.com/office/word/2010/wordprocessingShape" mc:Ignorable="w14 w15 w16se w16cid w16 w16cex w16sdtdh wp14">
   <w:body>
     <w:p>
       <w:pPr>
@@ -819,7 +819,10 @@
               <w:ind w:firstLine="0"/>
             </w:pPr>
             <w:r>
-              <w:t>Empty lane</w:t>
+              <w:t xml:space="preserve">Empty </w:t>
+            </w:r>
+            <w:r>
+              <w:t>column</w:t>
             </w:r>
             <w:r>
               <w:t xml:space="preserve"> (4)</w:t>
@@ -5517,7 +5520,7 @@
 </file>
 
 <file path=word/numbering.xml><?xml version="1.0" encoding="utf-8"?>
-<w:numbering xmlns:wpc="http://schemas.microsoft.com/office/word/2010/wordprocessingCanvas" xmlns:cx="http://schemas.microsoft.com/office/drawing/2014/chartex" xmlns:cx1="http://schemas.microsoft.com/office/drawing/2015/9/8/chartex" xmlns:cx2="http://schemas.microsoft.com/office/drawing/2015/10/21/chartex" xmlns:cx3="http://schemas.microsoft.com/office/drawing/2016/5/9/chartex" xmlns:cx4="http://schemas.microsoft.com/office/drawing/2016/5/10/chartex" xmlns:cx5="http://schemas.microsoft.com/office/drawing/2016/5/11/chartex" xmlns:cx6="http://schemas.microsoft.com/office/drawing/2016/5/12/chartex" xmlns:cx7="http://schemas.microsoft.com/office/drawing/2016/5/13/chartex" xmlns:cx8="http://schemas.microsoft.com/office/drawing/2016/5/14/chartex" xmlns:mc="http://schemas.openxmlformats.org/markup-compatibility/2006" xmlns:aink="http://schemas.microsoft.com/office/drawing/2016/ink" xmlns:am3d="http://schemas.microsoft.com/office/drawing/2017/model3d" xmlns:o="urn:schemas-microsoft-com:office:office" xmlns:oel="http://schemas.microsoft.com/office/2019/extlst" xmlns:r="http://schemas.openxmlformats.org/officeDocument/2006/relationships" xmlns:m="http://schemas.openxmlformats.org/officeDocument/2006/math" xmlns:v="urn:schemas-microsoft-com:vml" xmlns:wp14="http://schemas.microsoft.com/office/word/2010/wordprocessingDrawing" xmlns:wp="http://schemas.openxmlformats.org/drawingml/2006/wordprocessingDrawing" xmlns:w10="urn:schemas-microsoft-com:office:word" xmlns:w="http://schemas.openxmlformats.org/wordprocessingml/2006/main" xmlns:w14="http://schemas.microsoft.com/office/word/2010/wordml" xmlns:w15="http://schemas.microsoft.com/office/word/2012/wordml" xmlns:w16cex="http://schemas.microsoft.com/office/word/2018/wordml/cex" xmlns:w16cid="http://schemas.microsoft.com/office/word/2016/wordml/cid" xmlns:w16="http://schemas.microsoft.com/office/word/2018/wordml" xmlns:w16du="http://schemas.microsoft.com/office/word/2023/wordml/word16du" xmlns:w16sdtdh="http://schemas.microsoft.com/office/word/2020/wordml/sdtdatahash" xmlns:w16sdtfl="http://schemas.microsoft.com/office/word/2024/wordml/sdtformatlock" xmlns:w16se="http://schemas.microsoft.com/office/word/2015/wordml/symex" xmlns:wpg="http://schemas.microsoft.com/office/word/2010/wordprocessingGroup" xmlns:wpi="http://schemas.microsoft.com/office/word/2010/wordprocessingInk" xmlns:wne="http://schemas.microsoft.com/office/word/2006/wordml" xmlns:wps="http://schemas.microsoft.com/office/word/2010/wordprocessingShape" mc:Ignorable="w14 w15 w16se w16cid w16 w16cex w16sdtdh w16sdtfl w16du wp14">
+<w:numbering xmlns:wpc="http://schemas.microsoft.com/office/word/2010/wordprocessingCanvas" xmlns:cx="http://schemas.microsoft.com/office/drawing/2014/chartex" xmlns:cx1="http://schemas.microsoft.com/office/drawing/2015/9/8/chartex" xmlns:cx2="http://schemas.microsoft.com/office/drawing/2015/10/21/chartex" xmlns:cx3="http://schemas.microsoft.com/office/drawing/2016/5/9/chartex" xmlns:cx4="http://schemas.microsoft.com/office/drawing/2016/5/10/chartex" xmlns:cx5="http://schemas.microsoft.com/office/drawing/2016/5/11/chartex" xmlns:cx6="http://schemas.microsoft.com/office/drawing/2016/5/12/chartex" xmlns:cx7="http://schemas.microsoft.com/office/drawing/2016/5/13/chartex" xmlns:cx8="http://schemas.microsoft.com/office/drawing/2016/5/14/chartex" xmlns:mc="http://schemas.openxmlformats.org/markup-compatibility/2006" xmlns:aink="http://schemas.microsoft.com/office/drawing/2016/ink" xmlns:am3d="http://schemas.microsoft.com/office/drawing/2017/model3d" xmlns:o="urn:schemas-microsoft-com:office:office" xmlns:oel="http://schemas.microsoft.com/office/2019/extlst" xmlns:r="http://schemas.openxmlformats.org/officeDocument/2006/relationships" xmlns:m="http://schemas.openxmlformats.org/officeDocument/2006/math" xmlns:v="urn:schemas-microsoft-com:vml" xmlns:wp14="http://schemas.microsoft.com/office/word/2010/wordprocessingDrawing" xmlns:wp="http://schemas.openxmlformats.org/drawingml/2006/wordprocessingDrawing" xmlns:w10="urn:schemas-microsoft-com:office:word" xmlns:w="http://schemas.openxmlformats.org/wordprocessingml/2006/main" xmlns:w14="http://schemas.microsoft.com/office/word/2010/wordml" xmlns:w15="http://schemas.microsoft.com/office/word/2012/wordml" xmlns:w16cex="http://schemas.microsoft.com/office/word/2018/wordml/cex" xmlns:w16cid="http://schemas.microsoft.com/office/word/2016/wordml/cid" xmlns:w16="http://schemas.microsoft.com/office/word/2018/wordml" xmlns:w16sdtdh="http://schemas.microsoft.com/office/word/2020/wordml/sdtdatahash" xmlns:w16se="http://schemas.microsoft.com/office/word/2015/wordml/symex" xmlns:wpg="http://schemas.microsoft.com/office/word/2010/wordprocessingGroup" xmlns:wpi="http://schemas.microsoft.com/office/word/2010/wordprocessingInk" xmlns:wne="http://schemas.microsoft.com/office/word/2006/wordml" xmlns:wps="http://schemas.microsoft.com/office/word/2010/wordprocessingShape" mc:Ignorable="w14 w15 w16se w16cid w16 w16cex w16sdtdh wp14">
   <w:abstractNum w:abstractNumId="0" w15:restartNumberingAfterBreak="0">
     <w:nsid w:val="02E537B6"/>
     <w:multiLevelType w:val="hybridMultilevel"/>
@@ -10716,7 +10719,7 @@
 </file>
 
 <file path=word/styles.xml><?xml version="1.0" encoding="utf-8"?>
-<w:styles xmlns:mc="http://schemas.openxmlformats.org/markup-compatibility/2006" xmlns:r="http://schemas.openxmlformats.org/officeDocument/2006/relationships" xmlns:w="http://schemas.openxmlformats.org/wordprocessingml/2006/main" xmlns:w14="http://schemas.microsoft.com/office/word/2010/wordml" xmlns:w15="http://schemas.microsoft.com/office/word/2012/wordml" xmlns:w16cex="http://schemas.microsoft.com/office/word/2018/wordml/cex" xmlns:w16cid="http://schemas.microsoft.com/office/word/2016/wordml/cid" xmlns:w16="http://schemas.microsoft.com/office/word/2018/wordml" xmlns:w16du="http://schemas.microsoft.com/office/word/2023/wordml/word16du" xmlns:w16sdtdh="http://schemas.microsoft.com/office/word/2020/wordml/sdtdatahash" xmlns:w16sdtfl="http://schemas.microsoft.com/office/word/2024/wordml/sdtformatlock" xmlns:w16se="http://schemas.microsoft.com/office/word/2015/wordml/symex" mc:Ignorable="w14 w15 w16se w16cid w16 w16cex w16sdtdh w16sdtfl w16du">
+<w:styles xmlns:mc="http://schemas.openxmlformats.org/markup-compatibility/2006" xmlns:r="http://schemas.openxmlformats.org/officeDocument/2006/relationships" xmlns:w="http://schemas.openxmlformats.org/wordprocessingml/2006/main" xmlns:w14="http://schemas.microsoft.com/office/word/2010/wordml" xmlns:w15="http://schemas.microsoft.com/office/word/2012/wordml" xmlns:w16cex="http://schemas.microsoft.com/office/word/2018/wordml/cex" xmlns:w16cid="http://schemas.microsoft.com/office/word/2016/wordml/cid" xmlns:w16="http://schemas.microsoft.com/office/word/2018/wordml" xmlns:w16sdtdh="http://schemas.microsoft.com/office/word/2020/wordml/sdtdatahash" xmlns:w16se="http://schemas.microsoft.com/office/word/2015/wordml/symex" mc:Ignorable="w14 w15 w16se w16cid w16 w16cex w16sdtdh">
   <w:docDefaults>
     <w:rPrDefault>
       <w:rPr>

</xml_diff>

<commit_message>
Update - Light Tweaks and Fixes VII
</commit_message>
<xml_diff>
--- a/ideas_ressources_files/initial_game_design_concept.docx
+++ b/ideas_ressources_files/initial_game_design_concept.docx
@@ -1,6 +1,6 @@
 
 <file path=word/document.xml><?xml version="1.0" encoding="utf-8"?>
-<w:document xmlns:wpc="http://schemas.microsoft.com/office/word/2010/wordprocessingCanvas" xmlns:cx="http://schemas.microsoft.com/office/drawing/2014/chartex" xmlns:cx1="http://schemas.microsoft.com/office/drawing/2015/9/8/chartex" xmlns:cx2="http://schemas.microsoft.com/office/drawing/2015/10/21/chartex" xmlns:cx3="http://schemas.microsoft.com/office/drawing/2016/5/9/chartex" xmlns:cx4="http://schemas.microsoft.com/office/drawing/2016/5/10/chartex" xmlns:cx5="http://schemas.microsoft.com/office/drawing/2016/5/11/chartex" xmlns:cx6="http://schemas.microsoft.com/office/drawing/2016/5/12/chartex" xmlns:cx7="http://schemas.microsoft.com/office/drawing/2016/5/13/chartex" xmlns:cx8="http://schemas.microsoft.com/office/drawing/2016/5/14/chartex" xmlns:mc="http://schemas.openxmlformats.org/markup-compatibility/2006" xmlns:aink="http://schemas.microsoft.com/office/drawing/2016/ink" xmlns:am3d="http://schemas.microsoft.com/office/drawing/2017/model3d" xmlns:o="urn:schemas-microsoft-com:office:office" xmlns:oel="http://schemas.microsoft.com/office/2019/extlst" xmlns:r="http://schemas.openxmlformats.org/officeDocument/2006/relationships" xmlns:m="http://schemas.openxmlformats.org/officeDocument/2006/math" xmlns:v="urn:schemas-microsoft-com:vml" xmlns:wp14="http://schemas.microsoft.com/office/word/2010/wordprocessingDrawing" xmlns:wp="http://schemas.openxmlformats.org/drawingml/2006/wordprocessingDrawing" xmlns:w10="urn:schemas-microsoft-com:office:word" xmlns:w="http://schemas.openxmlformats.org/wordprocessingml/2006/main" xmlns:w14="http://schemas.microsoft.com/office/word/2010/wordml" xmlns:w15="http://schemas.microsoft.com/office/word/2012/wordml" xmlns:w16cex="http://schemas.microsoft.com/office/word/2018/wordml/cex" xmlns:w16cid="http://schemas.microsoft.com/office/word/2016/wordml/cid" xmlns:w16="http://schemas.microsoft.com/office/word/2018/wordml" xmlns:w16sdtdh="http://schemas.microsoft.com/office/word/2020/wordml/sdtdatahash" xmlns:w16se="http://schemas.microsoft.com/office/word/2015/wordml/symex" xmlns:wpg="http://schemas.microsoft.com/office/word/2010/wordprocessingGroup" xmlns:wpi="http://schemas.microsoft.com/office/word/2010/wordprocessingInk" xmlns:wne="http://schemas.microsoft.com/office/word/2006/wordml" xmlns:wps="http://schemas.microsoft.com/office/word/2010/wordprocessingShape" mc:Ignorable="w14 w15 w16se w16cid w16 w16cex w16sdtdh wp14">
+<w:document xmlns:wpc="http://schemas.microsoft.com/office/word/2010/wordprocessingCanvas" xmlns:cx="http://schemas.microsoft.com/office/drawing/2014/chartex" xmlns:cx1="http://schemas.microsoft.com/office/drawing/2015/9/8/chartex" xmlns:cx2="http://schemas.microsoft.com/office/drawing/2015/10/21/chartex" xmlns:cx3="http://schemas.microsoft.com/office/drawing/2016/5/9/chartex" xmlns:cx4="http://schemas.microsoft.com/office/drawing/2016/5/10/chartex" xmlns:cx5="http://schemas.microsoft.com/office/drawing/2016/5/11/chartex" xmlns:cx6="http://schemas.microsoft.com/office/drawing/2016/5/12/chartex" xmlns:cx7="http://schemas.microsoft.com/office/drawing/2016/5/13/chartex" xmlns:cx8="http://schemas.microsoft.com/office/drawing/2016/5/14/chartex" xmlns:mc="http://schemas.openxmlformats.org/markup-compatibility/2006" xmlns:aink="http://schemas.microsoft.com/office/drawing/2016/ink" xmlns:am3d="http://schemas.microsoft.com/office/drawing/2017/model3d" xmlns:o="urn:schemas-microsoft-com:office:office" xmlns:oel="http://schemas.microsoft.com/office/2019/extlst" xmlns:r="http://schemas.openxmlformats.org/officeDocument/2006/relationships" xmlns:m="http://schemas.openxmlformats.org/officeDocument/2006/math" xmlns:v="urn:schemas-microsoft-com:vml" xmlns:wp14="http://schemas.microsoft.com/office/word/2010/wordprocessingDrawing" xmlns:wp="http://schemas.openxmlformats.org/drawingml/2006/wordprocessingDrawing" xmlns:w10="urn:schemas-microsoft-com:office:word" xmlns:w="http://schemas.openxmlformats.org/wordprocessingml/2006/main" xmlns:w14="http://schemas.microsoft.com/office/word/2010/wordml" xmlns:w15="http://schemas.microsoft.com/office/word/2012/wordml" xmlns:w16cex="http://schemas.microsoft.com/office/word/2018/wordml/cex" xmlns:w16cid="http://schemas.microsoft.com/office/word/2016/wordml/cid" xmlns:w16="http://schemas.microsoft.com/office/word/2018/wordml" xmlns:w16du="http://schemas.microsoft.com/office/word/2023/wordml/word16du" xmlns:w16sdtdh="http://schemas.microsoft.com/office/word/2020/wordml/sdtdatahash" xmlns:w16sdtfl="http://schemas.microsoft.com/office/word/2024/wordml/sdtformatlock" xmlns:w16se="http://schemas.microsoft.com/office/word/2015/wordml/symex" xmlns:wpg="http://schemas.microsoft.com/office/word/2010/wordprocessingGroup" xmlns:wpi="http://schemas.microsoft.com/office/word/2010/wordprocessingInk" xmlns:wne="http://schemas.microsoft.com/office/word/2006/wordml" xmlns:wps="http://schemas.microsoft.com/office/word/2010/wordprocessingShape" mc:Ignorable="w14 w15 w16se w16cid w16 w16cex w16sdtdh w16sdtfl w16du wp14">
   <w:body>
     <w:p>
       <w:pPr>
@@ -1358,6 +1358,9 @@
             <w:r>
               <w:t>Player choses to perform action from one of the three kinds</w:t>
             </w:r>
+            <w:r>
+              <w:t xml:space="preserve"> of actions</w:t>
+            </w:r>
           </w:p>
           <w:p>
             <w:pPr>
@@ -1628,7 +1631,13 @@
             </w:r>
             <w:proofErr w:type="spellEnd"/>
             <w:r>
-              <w:t xml:space="preserve"> cost Score Points to be spawned</w:t>
+              <w:t xml:space="preserve"> cost Score Points</w:t>
+            </w:r>
+            <w:r>
+              <w:t>*</w:t>
+            </w:r>
+            <w:r>
+              <w:t xml:space="preserve"> to be spawned</w:t>
             </w:r>
           </w:p>
         </w:tc>
@@ -1643,7 +1652,13 @@
               <w:ind w:firstLine="0"/>
             </w:pPr>
             <w:r>
-              <w:t>You gain Score Points at the start of the turn, based on which turn it is</w:t>
+              <w:t>You gain Score Points</w:t>
+            </w:r>
+            <w:r>
+              <w:t>*</w:t>
+            </w:r>
+            <w:r>
+              <w:t xml:space="preserve"> at the start of the turn, based on which turn it is</w:t>
             </w:r>
           </w:p>
         </w:tc>
@@ -1661,7 +1676,13 @@
               <w:ind w:firstLine="0"/>
             </w:pPr>
             <w:r>
-              <w:t>You gain Score Points for vanquishing plants</w:t>
+              <w:t>You gain Score Points</w:t>
+            </w:r>
+            <w:r>
+              <w:t>*</w:t>
+            </w:r>
+            <w:r>
+              <w:t xml:space="preserve"> for vanquishing plants</w:t>
             </w:r>
           </w:p>
         </w:tc>
@@ -1677,6 +1698,27 @@
             </w:pPr>
             <w:r>
               <w:t>There may be other miscellaneous sources of Score Points</w:t>
+            </w:r>
+            <w:r>
+              <w:t>*</w:t>
+            </w:r>
+          </w:p>
+        </w:tc>
+      </w:tr>
+      <w:tr>
+        <w:trPr>
+          <w:cnfStyle w:val="000000100000" w:firstRow="0" w:lastRow="0" w:firstColumn="0" w:lastColumn="0" w:oddVBand="0" w:evenVBand="0" w:oddHBand="1" w:evenHBand="0" w:firstRowFirstColumn="0" w:firstRowLastColumn="0" w:lastRowFirstColumn="0" w:lastRowLastColumn="0"/>
+        </w:trPr>
+        <w:tc>
+          <w:tcPr>
+            <w:tcW w:w="10456" w:type="dxa"/>
+          </w:tcPr>
+          <w:p>
+            <w:pPr>
+              <w:ind w:firstLine="0"/>
+            </w:pPr>
+            <w:r>
+              <w:t>*Name is a WIP</w:t>
             </w:r>
           </w:p>
         </w:tc>
@@ -1739,7 +1781,13 @@
             </w:r>
             <w:proofErr w:type="spellEnd"/>
             <w:r>
-              <w:t xml:space="preserve"> vanquish permanently but health and items reset if they survive a fight</w:t>
+              <w:t xml:space="preserve"> vanquish permanently but </w:t>
+            </w:r>
+            <w:r>
+              <w:t xml:space="preserve">their </w:t>
+            </w:r>
+            <w:r>
+              <w:t>health and items reset if they survive a fight</w:t>
             </w:r>
           </w:p>
         </w:tc>
@@ -2007,7 +2055,13 @@
               </w:numPr>
             </w:pPr>
             <w:r>
-              <w:t>Munch actives “eaten” abilities while strike doesn’t</w:t>
+              <w:t>Munch activ</w:t>
+            </w:r>
+            <w:r>
+              <w:t>ate</w:t>
+            </w:r>
+            <w:r>
+              <w:t>s “eaten” abilities while strike doesn’t</w:t>
             </w:r>
           </w:p>
         </w:tc>
@@ -2110,18 +2164,7 @@
               </w:numPr>
             </w:pPr>
             <w:r>
-              <w:t xml:space="preserve">Unlike weapons and gadgets, much like </w:t>
-            </w:r>
-            <w:proofErr w:type="spellStart"/>
-            <w:r>
-              <w:t>Spawnling</w:t>
-            </w:r>
-            <w:r>
-              <w:t>s</w:t>
-            </w:r>
-            <w:proofErr w:type="spellEnd"/>
-            <w:r>
-              <w:t>, the player can gather more than one of each</w:t>
+              <w:t>Unlike weapons and gadgets, the player can gather more than one of each</w:t>
             </w:r>
             <w:r>
               <w:t xml:space="preserve"> armour</w:t>
@@ -2247,6 +2290,7 @@
               </w:numPr>
             </w:pPr>
             <w:r>
+              <w:lastRenderedPageBreak/>
               <w:t>Two types; passives and actives</w:t>
             </w:r>
           </w:p>
@@ -2259,7 +2303,6 @@
               </w:numPr>
             </w:pPr>
             <w:r>
-              <w:lastRenderedPageBreak/>
               <w:t>Passives are equipped</w:t>
             </w:r>
             <w:r>
@@ -2294,7 +2337,13 @@
               <w:t xml:space="preserve"> ones use the armour slot</w:t>
             </w:r>
             <w:r>
-              <w:t>, or the “gadget slot”, meaning they don’t prevent use of armour</w:t>
+              <w:t>, which prevents only the use of armour</w:t>
+            </w:r>
+            <w:r>
+              <w:t xml:space="preserve">, or the “gadget slot”, meaning they </w:t>
+            </w:r>
+            <w:r>
+              <w:t>exist independently of attacks and armour</w:t>
             </w:r>
           </w:p>
           <w:p>
@@ -2349,6 +2398,9 @@
             </w:pPr>
             <w:r>
               <w:t>Only one Gadget may be in use at any given time</w:t>
+            </w:r>
+            <w:r>
+              <w:t>, active or passive</w:t>
             </w:r>
           </w:p>
         </w:tc>
@@ -2578,7 +2630,13 @@
               <w:t>Shot</w:t>
             </w:r>
             <w:r>
-              <w:t xml:space="preserve"> if there is a zombie on the line of fire</w:t>
+              <w:t xml:space="preserve"> if there is a zombie </w:t>
+            </w:r>
+            <w:r>
+              <w:t>i</w:t>
+            </w:r>
+            <w:r>
+              <w:t>n the line of fire</w:t>
             </w:r>
           </w:p>
           <w:p>
@@ -3886,7 +3944,13 @@
               </w:numPr>
             </w:pPr>
             <w:r>
-              <w:t>On Protector type plant: Doesn’t prevent Ranged negate damage from Ranged Pierce attacks on the plant behind but still takes it</w:t>
+              <w:t xml:space="preserve">On Protector type plant: Doesn’t </w:t>
+            </w:r>
+            <w:r>
+              <w:t>negate</w:t>
+            </w:r>
+            <w:r>
+              <w:t xml:space="preserve"> Ranged damage from Ranged Pierce attacks on the plant behind but still takes it</w:t>
             </w:r>
           </w:p>
         </w:tc>
@@ -5520,7 +5584,7 @@
 </file>
 
 <file path=word/numbering.xml><?xml version="1.0" encoding="utf-8"?>
-<w:numbering xmlns:wpc="http://schemas.microsoft.com/office/word/2010/wordprocessingCanvas" xmlns:cx="http://schemas.microsoft.com/office/drawing/2014/chartex" xmlns:cx1="http://schemas.microsoft.com/office/drawing/2015/9/8/chartex" xmlns:cx2="http://schemas.microsoft.com/office/drawing/2015/10/21/chartex" xmlns:cx3="http://schemas.microsoft.com/office/drawing/2016/5/9/chartex" xmlns:cx4="http://schemas.microsoft.com/office/drawing/2016/5/10/chartex" xmlns:cx5="http://schemas.microsoft.com/office/drawing/2016/5/11/chartex" xmlns:cx6="http://schemas.microsoft.com/office/drawing/2016/5/12/chartex" xmlns:cx7="http://schemas.microsoft.com/office/drawing/2016/5/13/chartex" xmlns:cx8="http://schemas.microsoft.com/office/drawing/2016/5/14/chartex" xmlns:mc="http://schemas.openxmlformats.org/markup-compatibility/2006" xmlns:aink="http://schemas.microsoft.com/office/drawing/2016/ink" xmlns:am3d="http://schemas.microsoft.com/office/drawing/2017/model3d" xmlns:o="urn:schemas-microsoft-com:office:office" xmlns:oel="http://schemas.microsoft.com/office/2019/extlst" xmlns:r="http://schemas.openxmlformats.org/officeDocument/2006/relationships" xmlns:m="http://schemas.openxmlformats.org/officeDocument/2006/math" xmlns:v="urn:schemas-microsoft-com:vml" xmlns:wp14="http://schemas.microsoft.com/office/word/2010/wordprocessingDrawing" xmlns:wp="http://schemas.openxmlformats.org/drawingml/2006/wordprocessingDrawing" xmlns:w10="urn:schemas-microsoft-com:office:word" xmlns:w="http://schemas.openxmlformats.org/wordprocessingml/2006/main" xmlns:w14="http://schemas.microsoft.com/office/word/2010/wordml" xmlns:w15="http://schemas.microsoft.com/office/word/2012/wordml" xmlns:w16cex="http://schemas.microsoft.com/office/word/2018/wordml/cex" xmlns:w16cid="http://schemas.microsoft.com/office/word/2016/wordml/cid" xmlns:w16="http://schemas.microsoft.com/office/word/2018/wordml" xmlns:w16sdtdh="http://schemas.microsoft.com/office/word/2020/wordml/sdtdatahash" xmlns:w16se="http://schemas.microsoft.com/office/word/2015/wordml/symex" xmlns:wpg="http://schemas.microsoft.com/office/word/2010/wordprocessingGroup" xmlns:wpi="http://schemas.microsoft.com/office/word/2010/wordprocessingInk" xmlns:wne="http://schemas.microsoft.com/office/word/2006/wordml" xmlns:wps="http://schemas.microsoft.com/office/word/2010/wordprocessingShape" mc:Ignorable="w14 w15 w16se w16cid w16 w16cex w16sdtdh wp14">
+<w:numbering xmlns:wpc="http://schemas.microsoft.com/office/word/2010/wordprocessingCanvas" xmlns:cx="http://schemas.microsoft.com/office/drawing/2014/chartex" xmlns:cx1="http://schemas.microsoft.com/office/drawing/2015/9/8/chartex" xmlns:cx2="http://schemas.microsoft.com/office/drawing/2015/10/21/chartex" xmlns:cx3="http://schemas.microsoft.com/office/drawing/2016/5/9/chartex" xmlns:cx4="http://schemas.microsoft.com/office/drawing/2016/5/10/chartex" xmlns:cx5="http://schemas.microsoft.com/office/drawing/2016/5/11/chartex" xmlns:cx6="http://schemas.microsoft.com/office/drawing/2016/5/12/chartex" xmlns:cx7="http://schemas.microsoft.com/office/drawing/2016/5/13/chartex" xmlns:cx8="http://schemas.microsoft.com/office/drawing/2016/5/14/chartex" xmlns:mc="http://schemas.openxmlformats.org/markup-compatibility/2006" xmlns:aink="http://schemas.microsoft.com/office/drawing/2016/ink" xmlns:am3d="http://schemas.microsoft.com/office/drawing/2017/model3d" xmlns:o="urn:schemas-microsoft-com:office:office" xmlns:oel="http://schemas.microsoft.com/office/2019/extlst" xmlns:r="http://schemas.openxmlformats.org/officeDocument/2006/relationships" xmlns:m="http://schemas.openxmlformats.org/officeDocument/2006/math" xmlns:v="urn:schemas-microsoft-com:vml" xmlns:wp14="http://schemas.microsoft.com/office/word/2010/wordprocessingDrawing" xmlns:wp="http://schemas.openxmlformats.org/drawingml/2006/wordprocessingDrawing" xmlns:w10="urn:schemas-microsoft-com:office:word" xmlns:w="http://schemas.openxmlformats.org/wordprocessingml/2006/main" xmlns:w14="http://schemas.microsoft.com/office/word/2010/wordml" xmlns:w15="http://schemas.microsoft.com/office/word/2012/wordml" xmlns:w16cex="http://schemas.microsoft.com/office/word/2018/wordml/cex" xmlns:w16cid="http://schemas.microsoft.com/office/word/2016/wordml/cid" xmlns:w16="http://schemas.microsoft.com/office/word/2018/wordml" xmlns:w16du="http://schemas.microsoft.com/office/word/2023/wordml/word16du" xmlns:w16sdtdh="http://schemas.microsoft.com/office/word/2020/wordml/sdtdatahash" xmlns:w16sdtfl="http://schemas.microsoft.com/office/word/2024/wordml/sdtformatlock" xmlns:w16se="http://schemas.microsoft.com/office/word/2015/wordml/symex" xmlns:wpg="http://schemas.microsoft.com/office/word/2010/wordprocessingGroup" xmlns:wpi="http://schemas.microsoft.com/office/word/2010/wordprocessingInk" xmlns:wne="http://schemas.microsoft.com/office/word/2006/wordml" xmlns:wps="http://schemas.microsoft.com/office/word/2010/wordprocessingShape" mc:Ignorable="w14 w15 w16se w16cid w16 w16cex w16sdtdh w16sdtfl w16du wp14">
   <w:abstractNum w:abstractNumId="0" w15:restartNumberingAfterBreak="0">
     <w:nsid w:val="02E537B6"/>
     <w:multiLevelType w:val="hybridMultilevel"/>
@@ -10719,7 +10783,7 @@
 </file>
 
 <file path=word/styles.xml><?xml version="1.0" encoding="utf-8"?>
-<w:styles xmlns:mc="http://schemas.openxmlformats.org/markup-compatibility/2006" xmlns:r="http://schemas.openxmlformats.org/officeDocument/2006/relationships" xmlns:w="http://schemas.openxmlformats.org/wordprocessingml/2006/main" xmlns:w14="http://schemas.microsoft.com/office/word/2010/wordml" xmlns:w15="http://schemas.microsoft.com/office/word/2012/wordml" xmlns:w16cex="http://schemas.microsoft.com/office/word/2018/wordml/cex" xmlns:w16cid="http://schemas.microsoft.com/office/word/2016/wordml/cid" xmlns:w16="http://schemas.microsoft.com/office/word/2018/wordml" xmlns:w16sdtdh="http://schemas.microsoft.com/office/word/2020/wordml/sdtdatahash" xmlns:w16se="http://schemas.microsoft.com/office/word/2015/wordml/symex" mc:Ignorable="w14 w15 w16se w16cid w16 w16cex w16sdtdh">
+<w:styles xmlns:mc="http://schemas.openxmlformats.org/markup-compatibility/2006" xmlns:r="http://schemas.openxmlformats.org/officeDocument/2006/relationships" xmlns:w="http://schemas.openxmlformats.org/wordprocessingml/2006/main" xmlns:w14="http://schemas.microsoft.com/office/word/2010/wordml" xmlns:w15="http://schemas.microsoft.com/office/word/2012/wordml" xmlns:w16cex="http://schemas.microsoft.com/office/word/2018/wordml/cex" xmlns:w16cid="http://schemas.microsoft.com/office/word/2016/wordml/cid" xmlns:w16="http://schemas.microsoft.com/office/word/2018/wordml" xmlns:w16du="http://schemas.microsoft.com/office/word/2023/wordml/word16du" xmlns:w16sdtdh="http://schemas.microsoft.com/office/word/2020/wordml/sdtdatahash" xmlns:w16sdtfl="http://schemas.microsoft.com/office/word/2024/wordml/sdtformatlock" xmlns:w16se="http://schemas.microsoft.com/office/word/2015/wordml/symex" mc:Ignorable="w14 w15 w16se w16cid w16 w16cex w16sdtdh w16sdtfl w16du">
   <w:docDefaults>
     <w:rPrDefault>
       <w:rPr>

</xml_diff>